<commit_message>
Taqrizga imzo qatori qo'shildi
Co-Authored-By: Claude Opus 5.5 <noreply@anthropic.com>
Claude-Session: https://claude.ai/code/session_01Rz5ev5ZXmxuLtsDnom5zbD
</commit_message>
<xml_diff>
--- a/out/Taqriz_Isroilova_tuzatilgan.docx
+++ b/out/Taqriz_Isroilova_tuzatilgan.docx
@@ -1794,17 +1794,166 @@
     </w:p>
     <w:p>
       <w:pPr>
+        <w:tabs>
+          <w:tab w:val="right" w:pos="9922"/>
+        </w:tabs>
         <w:spacing w:after="0" w:line="240" w:lineRule="auto"/>
-        <w:ind w:firstLine="567"/>
-        <w:rPr>
-          <w:rFonts w:ascii="Times New Roman" w:hAnsi="Times New Roman" w:cs="Times New Roman"/>
-          <w:b/>
-          <w:bCs/>
-          <w:sz w:val="28"/>
-          <w:szCs w:val="28"/>
-          <w:lang w:val="uz-Cyrl-UZ"/>
-        </w:rPr>
-      </w:pPr>
+        <w:rPr>
+          <w:rFonts w:ascii="Times New Roman" w:hAnsi="Times New Roman" w:cs="Times New Roman"/>
+          <w:b/>
+          <w:bCs/>
+          <w:sz w:val="28"/>
+          <w:szCs w:val="28"/>
+          <w:lang w:val="uz-Cyrl-UZ"/>
+        </w:rPr>
+      </w:pPr>
+      <w:r>
+        <w:rPr>
+          <w:rFonts w:ascii="Times New Roman" w:hAnsi="Times New Roman" w:cs="Times New Roman"/>
+          <w:b/>
+          <w:bCs/>
+          <w:sz w:val="28"/>
+          <w:szCs w:val="28"/>
+          <w:highlight w:val="yellow"/>
+          <w:lang w:val="uz-Latn-UZ"/>
+        </w:rPr>
+        <w:t xml:space="preserve">Farg‘ona</w:t>
+      </w:r>
+      <w:r>
+        <w:rPr>
+          <w:rFonts w:ascii="Times New Roman" w:hAnsi="Times New Roman" w:cs="Times New Roman"/>
+          <w:b/>
+          <w:bCs/>
+          <w:sz w:val="28"/>
+          <w:szCs w:val="28"/>
+          <w:lang w:val="uz-Latn-UZ"/>
+        </w:rPr>
+        <w:t xml:space="preserve"> davlat universiteti psixologiya</w:t>
+      </w:r>
+      <w:r>
+        <w:rPr>
+          <w:rFonts w:ascii="Times New Roman" w:hAnsi="Times New Roman" w:cs="Times New Roman"/>
+          <w:b/>
+          <w:bCs/>
+          <w:sz w:val="28"/>
+          <w:szCs w:val="28"/>
+          <w:lang w:val="uz-Latn-UZ"/>
+        </w:rPr>
+        <w:br/>
+      </w:r>
+      <w:r>
+        <w:rPr>
+          <w:rFonts w:ascii="Times New Roman" w:hAnsi="Times New Roman" w:cs="Times New Roman"/>
+          <w:b/>
+          <w:bCs/>
+          <w:sz w:val="28"/>
+          <w:szCs w:val="28"/>
+          <w:lang w:val="uz-Latn-UZ"/>
+        </w:rPr>
+        <w:t xml:space="preserve">kafedrasi mudiri</w:t>
+      </w:r>
+      <w:r>
+        <w:rPr>
+          <w:rFonts w:ascii="Times New Roman" w:hAnsi="Times New Roman" w:cs="Times New Roman"/>
+          <w:b/>
+          <w:bCs/>
+          <w:sz w:val="28"/>
+          <w:szCs w:val="28"/>
+          <w:highlight w:val="yellow"/>
+          <w:lang w:val="uz-Latn-UZ"/>
+        </w:rPr>
+        <w:t xml:space="preserve">,</w:t>
+      </w:r>
+      <w:r>
+        <w:rPr>
+          <w:rFonts w:ascii="Times New Roman" w:hAnsi="Times New Roman" w:cs="Times New Roman"/>
+          <w:b/>
+          <w:bCs/>
+          <w:sz w:val="28"/>
+          <w:szCs w:val="28"/>
+          <w:lang w:val="uz-Latn-UZ"/>
+        </w:rPr>
+        <w:t xml:space="preserve"> psixologiya fanlari</w:t>
+      </w:r>
+      <w:r>
+        <w:rPr>
+          <w:rFonts w:ascii="Times New Roman" w:hAnsi="Times New Roman" w:cs="Times New Roman"/>
+          <w:b/>
+          <w:bCs/>
+          <w:sz w:val="28"/>
+          <w:szCs w:val="28"/>
+          <w:lang w:val="uz-Latn-UZ"/>
+        </w:rPr>
+        <w:br/>
+      </w:r>
+      <w:r>
+        <w:rPr>
+          <w:rFonts w:ascii="Times New Roman" w:hAnsi="Times New Roman" w:cs="Times New Roman"/>
+          <w:b/>
+          <w:bCs/>
+          <w:sz w:val="28"/>
+          <w:szCs w:val="28"/>
+          <w:highlight w:val="yellow"/>
+          <w:lang w:val="uz-Latn-UZ"/>
+        </w:rPr>
+        <w:t xml:space="preserve">bo‘yicha</w:t>
+      </w:r>
+      <w:r>
+        <w:rPr>
+          <w:rFonts w:ascii="Times New Roman" w:hAnsi="Times New Roman" w:cs="Times New Roman"/>
+          <w:b/>
+          <w:bCs/>
+          <w:sz w:val="28"/>
+          <w:szCs w:val="28"/>
+          <w:lang w:val="uz-Latn-UZ"/>
+        </w:rPr>
+        <w:t xml:space="preserve"> falsafa doktori</w:t>
+      </w:r>
+      <w:r>
+        <w:rPr>
+          <w:rFonts w:ascii="Times New Roman" w:hAnsi="Times New Roman" w:cs="Times New Roman"/>
+          <w:b/>
+          <w:bCs/>
+          <w:sz w:val="28"/>
+          <w:szCs w:val="28"/>
+          <w:highlight w:val="yellow"/>
+          <w:lang w:val="uz-Latn-UZ"/>
+        </w:rPr>
+        <w:t xml:space="preserve"> </w:t>
+      </w:r>
+      <w:r>
+        <w:rPr>
+          <w:rFonts w:ascii="Times New Roman" w:hAnsi="Times New Roman" w:cs="Times New Roman"/>
+          <w:b/>
+          <w:bCs/>
+          <w:sz w:val="28"/>
+          <w:szCs w:val="28"/>
+          <w:lang w:val="uz-Latn-UZ"/>
+        </w:rPr>
+        <w:t xml:space="preserve">(PhD), dotsent:</w:t>
+      </w:r>
+      <w:r>
+        <w:rPr>
+          <w:rFonts w:ascii="Times New Roman" w:hAnsi="Times New Roman" w:cs="Times New Roman"/>
+          <w:b/>
+          <w:bCs/>
+          <w:sz w:val="28"/>
+          <w:szCs w:val="28"/>
+          <w:lang w:val="uz-Latn-UZ"/>
+        </w:rPr>
+        <w:tab/>
+      </w:r>
+      <w:r>
+        <w:rPr>
+          <w:rFonts w:ascii="Times New Roman" w:hAnsi="Times New Roman" w:cs="Times New Roman"/>
+          <w:b/>
+          <w:bCs/>
+          <w:sz w:val="28"/>
+          <w:szCs w:val="28"/>
+          <w:lang w:val="uz-Latn-UZ"/>
+        </w:rPr>
+        <w:t xml:space="preserve">Sh.A.Usmonov</w:t>
+      </w:r>
     </w:p>
     <w:p>
       <w:pPr>

</xml_diff>